<commit_message>
Abans de fer canvis reunió
Reunió 24/02/2026. Hem parlat alguns canvis com eliminar el buffer, fer distància a 199 per incloure punt de la diagonal etc.  Ara a partir d'aquí faré una branca per aplicar aquests canvis
</commit_message>
<xml_diff>
--- a/docs/Reunio_20260224.docx
+++ b/docs/Reunio_20260224.docx
@@ -15,6 +15,51 @@
           <w:u w:val="single"/>
         </w:rPr>
         <w:t>Guió reunió 24/2/26</w:t>
+      </w:r>
+    </w:p>
+    <w:p>
+      <w:r>
+        <w:t xml:space="preserve">Abans de triar el mètode vam comparar com queda la distribució amb GRTS </w:t>
+      </w:r>
+      <w:proofErr w:type="spellStart"/>
+      <w:r>
+        <w:t>vs</w:t>
+      </w:r>
+      <w:proofErr w:type="spellEnd"/>
+      <w:r>
+        <w:t xml:space="preserve"> atzar i només el 1.6% de les tirades a l’atzar tenia una millor distribució espacial que amb GRTS. Aquesta distribució es mira amb </w:t>
+      </w:r>
+      <w:proofErr w:type="spellStart"/>
+      <w:r>
+        <w:t>l’index</w:t>
+      </w:r>
+      <w:proofErr w:type="spellEnd"/>
+      <w:r>
+        <w:t xml:space="preserve"> de balanç espacial (</w:t>
+      </w:r>
+      <w:proofErr w:type="spellStart"/>
+      <w:r>
+        <w:t>Pielou’s</w:t>
+      </w:r>
+      <w:proofErr w:type="spellEnd"/>
+      <w:r>
+        <w:t xml:space="preserve"> </w:t>
+      </w:r>
+      <w:proofErr w:type="spellStart"/>
+      <w:r>
+        <w:t>eveness</w:t>
+      </w:r>
+      <w:proofErr w:type="spellEnd"/>
+      <w:r>
+        <w:t xml:space="preserve">, que es basa en els polígons de </w:t>
+      </w:r>
+      <w:proofErr w:type="spellStart"/>
+      <w:r>
+        <w:t>Voronoi</w:t>
+      </w:r>
+      <w:proofErr w:type="spellEnd"/>
+      <w:r>
+        <w:t>).</w:t>
       </w:r>
     </w:p>
     <w:p>
@@ -105,6 +150,24 @@
       </w:r>
       <w:proofErr w:type="spellEnd"/>
       <w:r>
+        <w:rPr>
+          <w:i/>
+        </w:rPr>
+        <w:t xml:space="preserve"> (</w:t>
+      </w:r>
+      <w:r>
+        <w:rPr>
+          <w:i/>
+        </w:rPr>
+        <w:t>https://usepa.github.io/spsurvey/</w:t>
+      </w:r>
+      <w:r>
+        <w:rPr>
+          <w:i/>
+        </w:rPr>
+        <w:t>)</w:t>
+      </w:r>
+      <w:r>
         <w:t xml:space="preserve"> sobre els punts disponibles. </w:t>
       </w:r>
     </w:p>
@@ -174,8 +237,6 @@
         </w:rPr>
         <w:t xml:space="preserve">Resultats: </w:t>
       </w:r>
-      <w:bookmarkStart w:id="0" w:name="_GoBack"/>
-      <w:bookmarkEnd w:id="0"/>
     </w:p>
     <w:p>
       <w:r>
@@ -882,6 +943,301 @@
       </w:tr>
     </w:tbl>
     <w:p/>
+    <w:p>
+      <w:pPr>
+        <w:rPr>
+          <w:b/>
+          <w:u w:val="single"/>
+        </w:rPr>
+      </w:pPr>
+      <w:r>
+        <w:rPr>
+          <w:b/>
+          <w:u w:val="single"/>
+        </w:rPr>
+        <w:t>Post reunió 24/2/26</w:t>
+      </w:r>
+    </w:p>
+    <w:p>
+      <w:r>
+        <w:t>En primer lloc hem decidit eliminar els buffers ja que afecten de forma més pronunciada als polígons petits i condiciona la disponibilitat de punts</w:t>
+      </w:r>
+    </w:p>
+    <w:p>
+      <w:pPr>
+        <w:rPr>
+          <w:b/>
+        </w:rPr>
+      </w:pPr>
+      <w:r>
+        <w:tab/>
+      </w:r>
+      <w:r>
+        <w:rPr>
+          <w:u w:val="single"/>
+        </w:rPr>
+        <w:t xml:space="preserve">Decisió: </w:t>
+      </w:r>
+      <w:r>
+        <w:rPr>
+          <w:b/>
+        </w:rPr>
+        <w:t>NO aplicar mai el buffer</w:t>
+      </w:r>
+    </w:p>
+    <w:p>
+      <w:r>
+        <w:t xml:space="preserve">Diferència entre malla a 100m i que no hi càpiguen 30 punts separats 200m entre ells. Doncs repetir el procés sense restricció de distància. </w:t>
+      </w:r>
+      <w:r>
+        <w:t xml:space="preserve">Primer utilitzar malla 200m (no directament la de 100m), en cas de que no hi hagi punts suficients utilitzar malla de 100m? </w:t>
+      </w:r>
+    </w:p>
+    <w:p>
+      <w:pPr>
+        <w:rPr>
+          <w:b/>
+        </w:rPr>
+      </w:pPr>
+      <w:r>
+        <w:tab/>
+      </w:r>
+      <w:r>
+        <w:rPr>
+          <w:u w:val="single"/>
+        </w:rPr>
+        <w:t xml:space="preserve">Decisió: </w:t>
+      </w:r>
+      <w:r>
+        <w:rPr>
+          <w:b/>
+        </w:rPr>
+        <w:t xml:space="preserve">Parlar amb Aaron, defensar GRTS 30 punts 200m </w:t>
+      </w:r>
+      <w:r>
+        <w:rPr>
+          <w:b/>
+        </w:rPr>
+        <w:t>agafarà la millor combinació possible. Millor que directament 100m? Per intentar tenir el màxim nombre de punts possibles a 200m?</w:t>
+      </w:r>
+    </w:p>
+    <w:p>
+      <w:pPr>
+        <w:rPr>
+          <w:b/>
+        </w:rPr>
+      </w:pPr>
+      <w:r>
+        <w:rPr>
+          <w:b/>
+        </w:rPr>
+        <w:t xml:space="preserve">Punts de reserva: </w:t>
+      </w:r>
+    </w:p>
+    <w:p>
+      <w:pPr>
+        <w:pStyle w:val="Pargrafdellista"/>
+        <w:numPr>
+          <w:ilvl w:val="0"/>
+          <w:numId w:val="2"/>
+        </w:numPr>
+      </w:pPr>
+      <w:r>
+        <w:t xml:space="preserve">Si el punt no es l’habitat caminar 20m al N, després al E, després al S i finalment a l’Oest per trobar un punt. </w:t>
+      </w:r>
+    </w:p>
+    <w:p>
+      <w:pPr>
+        <w:pStyle w:val="Pargrafdellista"/>
+        <w:numPr>
+          <w:ilvl w:val="0"/>
+          <w:numId w:val="2"/>
+        </w:numPr>
+      </w:pPr>
+      <w:r>
+        <w:t>Si en cap d’aquests casos s’ha trobat. Anar al punt de l’hexàgon més al N i si no anar en sentit horari</w:t>
+      </w:r>
+    </w:p>
+    <w:p>
+      <w:pPr>
+        <w:pStyle w:val="Pargrafdellista"/>
+        <w:numPr>
+          <w:ilvl w:val="0"/>
+          <w:numId w:val="2"/>
+        </w:numPr>
+      </w:pPr>
+      <w:r>
+        <w:t xml:space="preserve">Si cap d’aquests punts es l’habitat, anar a punt de reserva. </w:t>
+      </w:r>
+    </w:p>
+    <w:p>
+      <w:pPr>
+        <w:pStyle w:val="Pargrafdellista"/>
+        <w:numPr>
+          <w:ilvl w:val="1"/>
+          <w:numId w:val="2"/>
+        </w:numPr>
+        <w:rPr>
+          <w:b/>
+        </w:rPr>
+      </w:pPr>
+      <w:r>
+        <w:rPr>
+          <w:b/>
+        </w:rPr>
+        <w:t>Punt de reserva</w:t>
+      </w:r>
+      <w:r>
+        <w:rPr>
+          <w:b/>
+        </w:rPr>
+        <w:t xml:space="preserve"> es pot generar per GRTS maximitzant la millor distribució espacial. </w:t>
+      </w:r>
+      <w:proofErr w:type="spellStart"/>
+      <w:r>
+        <w:rPr>
+          <w:b/>
+        </w:rPr>
+        <w:t>N_base</w:t>
+      </w:r>
+      <w:proofErr w:type="spellEnd"/>
+      <w:r>
+        <w:rPr>
+          <w:b/>
+        </w:rPr>
+        <w:t xml:space="preserve"> = 30 + </w:t>
+      </w:r>
+      <w:proofErr w:type="spellStart"/>
+      <w:r>
+        <w:rPr>
+          <w:b/>
+        </w:rPr>
+        <w:t>n_over</w:t>
+      </w:r>
+      <w:proofErr w:type="spellEnd"/>
+      <w:r>
+        <w:rPr>
+          <w:b/>
+        </w:rPr>
+        <w:t xml:space="preserve"> = 10. Si augmentem molt el </w:t>
+      </w:r>
+      <w:proofErr w:type="spellStart"/>
+      <w:r>
+        <w:rPr>
+          <w:b/>
+        </w:rPr>
+        <w:t>n_over</w:t>
+      </w:r>
+      <w:proofErr w:type="spellEnd"/>
+      <w:r>
+        <w:rPr>
+          <w:b/>
+        </w:rPr>
+        <w:t xml:space="preserve"> comprometem la distribució espacial de </w:t>
+      </w:r>
+      <w:proofErr w:type="spellStart"/>
+      <w:r>
+        <w:rPr>
+          <w:b/>
+        </w:rPr>
+        <w:t>n_base</w:t>
+      </w:r>
+      <w:proofErr w:type="spellEnd"/>
+      <w:r>
+        <w:rPr>
+          <w:b/>
+        </w:rPr>
+        <w:t xml:space="preserve">, ens quedem amb aquest 10 – son un 33% dels punts, potser es massa?. </w:t>
+      </w:r>
+    </w:p>
+    <w:p>
+      <w:r>
+        <w:t xml:space="preserve">Estructura espacial de quan es reaprofiten punts. Si agafem els punts mostrejats d’un HIC per explicar un grup de CORINE, la distribució espacial d’aquests </w:t>
+      </w:r>
+      <w:r>
+        <w:rPr>
+          <w:b/>
+        </w:rPr>
+        <w:t xml:space="preserve"> </w:t>
+      </w:r>
+      <w:r>
+        <w:t xml:space="preserve">encara es acceptable respecte a </w:t>
+      </w:r>
+      <w:proofErr w:type="spellStart"/>
+      <w:r>
+        <w:t>remostrejar</w:t>
+      </w:r>
+      <w:proofErr w:type="spellEnd"/>
+      <w:r>
+        <w:t xml:space="preserve"> el grup de CORINE a l’atzar?</w:t>
+      </w:r>
+    </w:p>
+    <w:p>
+      <w:pPr>
+        <w:rPr>
+          <w:b/>
+        </w:rPr>
+      </w:pPr>
+      <w:r>
+        <w:tab/>
+      </w:r>
+      <w:r>
+        <w:rPr>
+          <w:u w:val="single"/>
+        </w:rPr>
+        <w:t xml:space="preserve">Decisió: </w:t>
+      </w:r>
+      <w:r>
+        <w:rPr>
+          <w:b/>
+        </w:rPr>
+        <w:t xml:space="preserve">Intentar contestar aquesta pregunta. Possiblement no, però per respectar-ho hauríem d’afegir punts i esforç de mostreig. </w:t>
+      </w:r>
+    </w:p>
+    <w:p>
+      <w:r>
+        <w:t xml:space="preserve">Habitats petits, aplicar la malla de 100m i en els polígons que no encaixin fer el centroide del polígon. </w:t>
+      </w:r>
+    </w:p>
+    <w:p>
+      <w:r>
+        <w:tab/>
+      </w:r>
+      <w:r>
+        <w:rPr>
+          <w:u w:val="single"/>
+        </w:rPr>
+        <w:t xml:space="preserve">Decisió: </w:t>
+      </w:r>
+      <w:r>
+        <w:t xml:space="preserve">Cal filtrar els polígons amb una </w:t>
+      </w:r>
+      <w:proofErr w:type="spellStart"/>
+      <w:r>
+        <w:t>area</w:t>
+      </w:r>
+      <w:proofErr w:type="spellEnd"/>
+      <w:r>
+        <w:t xml:space="preserve"> inferior a </w:t>
+      </w:r>
+      <w:proofErr w:type="spellStart"/>
+      <w:r>
+        <w:t>l’area</w:t>
+      </w:r>
+      <w:proofErr w:type="spellEnd"/>
+      <w:r>
+        <w:t xml:space="preserve"> de l’inventari (200m2)?</w:t>
+      </w:r>
+    </w:p>
+    <w:p>
+      <w:r>
+        <w:t>Qualitat filtrada també?</w:t>
+      </w:r>
+    </w:p>
+    <w:p>
+      <w:bookmarkStart w:id="0" w:name="_GoBack"/>
+      <w:bookmarkEnd w:id="0"/>
+    </w:p>
     <w:sectPr>
       <w:pgSz w:w="11906" w:h="16838"/>
       <w:pgMar w:top="1417" w:right="1701" w:bottom="1417" w:left="1701" w:header="708" w:footer="708" w:gutter="0"/>
@@ -1006,8 +1362,100 @@
       </w:rPr>
     </w:lvl>
   </w:abstractNum>
+  <w:abstractNum w:abstractNumId="1" w15:restartNumberingAfterBreak="0">
+    <w:nsid w:val="7894116B"/>
+    <w:multiLevelType w:val="hybridMultilevel"/>
+    <w:tmpl w:val="BF106F2E"/>
+    <w:lvl w:ilvl="0" w:tplc="0403000F">
+      <w:start w:val="1"/>
+      <w:numFmt w:val="decimal"/>
+      <w:lvlText w:val="%1."/>
+      <w:lvlJc w:val="left"/>
+      <w:pPr>
+        <w:ind w:left="720" w:hanging="360"/>
+      </w:pPr>
+      <w:rPr>
+        <w:rFonts w:hint="default"/>
+      </w:rPr>
+    </w:lvl>
+    <w:lvl w:ilvl="1" w:tplc="04030019">
+      <w:start w:val="1"/>
+      <w:numFmt w:val="lowerLetter"/>
+      <w:lvlText w:val="%2."/>
+      <w:lvlJc w:val="left"/>
+      <w:pPr>
+        <w:ind w:left="1440" w:hanging="360"/>
+      </w:pPr>
+    </w:lvl>
+    <w:lvl w:ilvl="2" w:tplc="0403001B" w:tentative="1">
+      <w:start w:val="1"/>
+      <w:numFmt w:val="lowerRoman"/>
+      <w:lvlText w:val="%3."/>
+      <w:lvlJc w:val="right"/>
+      <w:pPr>
+        <w:ind w:left="2160" w:hanging="180"/>
+      </w:pPr>
+    </w:lvl>
+    <w:lvl w:ilvl="3" w:tplc="0403000F" w:tentative="1">
+      <w:start w:val="1"/>
+      <w:numFmt w:val="decimal"/>
+      <w:lvlText w:val="%4."/>
+      <w:lvlJc w:val="left"/>
+      <w:pPr>
+        <w:ind w:left="2880" w:hanging="360"/>
+      </w:pPr>
+    </w:lvl>
+    <w:lvl w:ilvl="4" w:tplc="04030019" w:tentative="1">
+      <w:start w:val="1"/>
+      <w:numFmt w:val="lowerLetter"/>
+      <w:lvlText w:val="%5."/>
+      <w:lvlJc w:val="left"/>
+      <w:pPr>
+        <w:ind w:left="3600" w:hanging="360"/>
+      </w:pPr>
+    </w:lvl>
+    <w:lvl w:ilvl="5" w:tplc="0403001B" w:tentative="1">
+      <w:start w:val="1"/>
+      <w:numFmt w:val="lowerRoman"/>
+      <w:lvlText w:val="%6."/>
+      <w:lvlJc w:val="right"/>
+      <w:pPr>
+        <w:ind w:left="4320" w:hanging="180"/>
+      </w:pPr>
+    </w:lvl>
+    <w:lvl w:ilvl="6" w:tplc="0403000F" w:tentative="1">
+      <w:start w:val="1"/>
+      <w:numFmt w:val="decimal"/>
+      <w:lvlText w:val="%7."/>
+      <w:lvlJc w:val="left"/>
+      <w:pPr>
+        <w:ind w:left="5040" w:hanging="360"/>
+      </w:pPr>
+    </w:lvl>
+    <w:lvl w:ilvl="7" w:tplc="04030019" w:tentative="1">
+      <w:start w:val="1"/>
+      <w:numFmt w:val="lowerLetter"/>
+      <w:lvlText w:val="%8."/>
+      <w:lvlJc w:val="left"/>
+      <w:pPr>
+        <w:ind w:left="5760" w:hanging="360"/>
+      </w:pPr>
+    </w:lvl>
+    <w:lvl w:ilvl="8" w:tplc="0403001B" w:tentative="1">
+      <w:start w:val="1"/>
+      <w:numFmt w:val="lowerRoman"/>
+      <w:lvlText w:val="%9."/>
+      <w:lvlJc w:val="right"/>
+      <w:pPr>
+        <w:ind w:left="6480" w:hanging="180"/>
+      </w:pPr>
+    </w:lvl>
+  </w:abstractNum>
   <w:num w:numId="1">
     <w:abstractNumId w:val="0"/>
+  </w:num>
+  <w:num w:numId="2">
+    <w:abstractNumId w:val="1"/>
   </w:num>
 </w:numbering>
 </file>
@@ -1760,6 +2208,23 @@
 </file>
 
 <file path=customXml/item1.xml><?xml version="1.0" encoding="utf-8"?>
+<p:properties xmlns:p="http://schemas.microsoft.com/office/2006/metadata/properties" xmlns:xsi="http://www.w3.org/2001/XMLSchema-instance" xmlns:pc="http://schemas.microsoft.com/office/infopath/2007/PartnerControls">
+  <documentManagement>
+    <_activity xmlns="a4f05a8b-6c99-4fde-9c58-e847a1350398" xsi:nil="true"/>
+  </documentManagement>
+</p:properties>
+</file>
+
+<file path=customXml/item2.xml><?xml version="1.0" encoding="utf-8"?>
+<?mso-contentType ?>
+<FormTemplates xmlns="http://schemas.microsoft.com/sharepoint/v3/contenttype/forms">
+  <Display>DocumentLibraryForm</Display>
+  <Edit>DocumentLibraryForm</Edit>
+  <New>DocumentLibraryForm</New>
+</FormTemplates>
+</file>
+
+<file path=customXml/item3.xml><?xml version="1.0" encoding="utf-8"?>
 <ct:contentTypeSchema xmlns:ct="http://schemas.microsoft.com/office/2006/metadata/contentType" xmlns:ma="http://schemas.microsoft.com/office/2006/metadata/properties/metaAttributes" ct:_="" ma:_="" ma:contentTypeName="Documento" ma:contentTypeID="0x010100E6C750F080D38148A6E2E1F0D59240B8" ma:contentTypeVersion="18" ma:contentTypeDescription="Crear nuevo documento." ma:contentTypeScope="" ma:versionID="5d219beee1bc8409e2793424cf8b6390">
   <xsd:schema xmlns:xsd="http://www.w3.org/2001/XMLSchema" xmlns:xs="http://www.w3.org/2001/XMLSchema" xmlns:p="http://schemas.microsoft.com/office/2006/metadata/properties" xmlns:ns3="a4f05a8b-6c99-4fde-9c58-e847a1350398" xmlns:ns4="c4bef083-dd18-488d-8b49-2edaf9c952e6" targetNamespace="http://schemas.microsoft.com/office/2006/metadata/properties" ma:root="true" ma:fieldsID="8a44af6ac68894687ce84c9b1fb7f8c8" ns3:_="" ns4:_="">
     <xsd:import namespace="a4f05a8b-6c99-4fde-9c58-e847a1350398"/>
@@ -2012,24 +2477,32 @@
 </ct:contentTypeSchema>
 </file>
 
-<file path=customXml/item2.xml><?xml version="1.0" encoding="utf-8"?>
-<?mso-contentType ?>
-<FormTemplates xmlns="http://schemas.microsoft.com/sharepoint/v3/contenttype/forms">
-  <Display>DocumentLibraryForm</Display>
-  <Edit>DocumentLibraryForm</Edit>
-  <New>DocumentLibraryForm</New>
-</FormTemplates>
+<file path=customXml/itemProps1.xml><?xml version="1.0" encoding="utf-8"?>
+<ds:datastoreItem xmlns:ds="http://schemas.openxmlformats.org/officeDocument/2006/customXml" ds:itemID="{2424136C-E2D1-4CB3-9E7D-DC2A4B5BF43E}">
+  <ds:schemaRefs>
+    <ds:schemaRef ds:uri="http://www.w3.org/XML/1998/namespace"/>
+    <ds:schemaRef ds:uri="http://schemas.microsoft.com/office/2006/documentManagement/types"/>
+    <ds:schemaRef ds:uri="http://purl.org/dc/dcmitype/"/>
+    <ds:schemaRef ds:uri="http://purl.org/dc/elements/1.1/"/>
+    <ds:schemaRef ds:uri="http://purl.org/dc/terms/"/>
+    <ds:schemaRef ds:uri="http://schemas.microsoft.com/office/infopath/2007/PartnerControls"/>
+    <ds:schemaRef ds:uri="http://schemas.openxmlformats.org/package/2006/metadata/core-properties"/>
+    <ds:schemaRef ds:uri="c4bef083-dd18-488d-8b49-2edaf9c952e6"/>
+    <ds:schemaRef ds:uri="a4f05a8b-6c99-4fde-9c58-e847a1350398"/>
+    <ds:schemaRef ds:uri="http://schemas.microsoft.com/office/2006/metadata/properties"/>
+  </ds:schemaRefs>
+</ds:datastoreItem>
 </file>
 
-<file path=customXml/item3.xml><?xml version="1.0" encoding="utf-8"?>
-<p:properties xmlns:p="http://schemas.microsoft.com/office/2006/metadata/properties" xmlns:xsi="http://www.w3.org/2001/XMLSchema-instance" xmlns:pc="http://schemas.microsoft.com/office/infopath/2007/PartnerControls">
-  <documentManagement>
-    <_activity xmlns="a4f05a8b-6c99-4fde-9c58-e847a1350398" xsi:nil="true"/>
-  </documentManagement>
-</p:properties>
+<file path=customXml/itemProps2.xml><?xml version="1.0" encoding="utf-8"?>
+<ds:datastoreItem xmlns:ds="http://schemas.openxmlformats.org/officeDocument/2006/customXml" ds:itemID="{34767179-5772-4F9C-BB05-503B51C9CA56}">
+  <ds:schemaRefs>
+    <ds:schemaRef ds:uri="http://schemas.microsoft.com/sharepoint/v3/contenttype/forms"/>
+  </ds:schemaRefs>
+</ds:datastoreItem>
 </file>
 
-<file path=customXml/itemProps1.xml><?xml version="1.0" encoding="utf-8"?>
+<file path=customXml/itemProps3.xml><?xml version="1.0" encoding="utf-8"?>
 <ds:datastoreItem xmlns:ds="http://schemas.openxmlformats.org/officeDocument/2006/customXml" ds:itemID="{A56AB109-8636-4262-9DEE-76DF04DC9519}">
   <ds:schemaRefs>
     <ds:schemaRef ds:uri="http://schemas.microsoft.com/office/2006/metadata/contentType"/>
@@ -2046,29 +2519,4 @@
     <ds:schemaRef ds:uri="http://schemas.microsoft.com/internal/obd"/>
   </ds:schemaRefs>
 </ds:datastoreItem>
-</file>
-
-<file path=customXml/itemProps2.xml><?xml version="1.0" encoding="utf-8"?>
-<ds:datastoreItem xmlns:ds="http://schemas.openxmlformats.org/officeDocument/2006/customXml" ds:itemID="{34767179-5772-4F9C-BB05-503B51C9CA56}">
-  <ds:schemaRefs>
-    <ds:schemaRef ds:uri="http://schemas.microsoft.com/sharepoint/v3/contenttype/forms"/>
-  </ds:schemaRefs>
-</ds:datastoreItem>
-</file>
-
-<file path=customXml/itemProps3.xml><?xml version="1.0" encoding="utf-8"?>
-<ds:datastoreItem xmlns:ds="http://schemas.openxmlformats.org/officeDocument/2006/customXml" ds:itemID="{2424136C-E2D1-4CB3-9E7D-DC2A4B5BF43E}">
-  <ds:schemaRefs>
-    <ds:schemaRef ds:uri="a4f05a8b-6c99-4fde-9c58-e847a1350398"/>
-    <ds:schemaRef ds:uri="http://purl.org/dc/elements/1.1/"/>
-    <ds:schemaRef ds:uri="http://schemas.openxmlformats.org/package/2006/metadata/core-properties"/>
-    <ds:schemaRef ds:uri="http://purl.org/dc/dcmitype/"/>
-    <ds:schemaRef ds:uri="http://www.w3.org/XML/1998/namespace"/>
-    <ds:schemaRef ds:uri="http://schemas.microsoft.com/office/2006/metadata/properties"/>
-    <ds:schemaRef ds:uri="http://schemas.microsoft.com/office/2006/documentManagement/types"/>
-    <ds:schemaRef ds:uri="http://schemas.microsoft.com/office/infopath/2007/PartnerControls"/>
-    <ds:schemaRef ds:uri="c4bef083-dd18-488d-8b49-2edaf9c952e6"/>
-    <ds:schemaRef ds:uri="http://purl.org/dc/terms/"/>
-  </ds:schemaRefs>
-</ds:datastoreItem>
 </file>
</xml_diff>